<commit_message>
adds tags for ordering
</commit_message>
<xml_diff>
--- a/Content/6.QuestForTheHighChestnut.docx
+++ b/Content/6.QuestForTheHighChestnut.docx
@@ -7,8 +7,6 @@
     <w:p>
       <w:r>
         <w:tab/>
-      </w:r>
-      <w:r>
         <w:t>The strange creature that appeared on the farm the next day sounded nothing like Uncle Earl, so Floydarina saw no harm in tormenting it to death. It was a squirrel-</w:t>
       </w:r>
       <w:proofErr w:type="gramStart"/>
@@ -626,10 +624,7 @@
     </w:p>
     <w:p>
       <w:r>
-        <w:t>“</w:t>
-      </w:r>
-      <w:r>
-        <w:t xml:space="preserve">Well, they get to be huge. I hatched in the ring left by the trunk of one that fell many </w:t>
+        <w:t xml:space="preserve">“Well, they get to be huge. I hatched in the ring left by the trunk of one that fell many </w:t>
       </w:r>
       <w:proofErr w:type="spellStart"/>
       <w:r>
@@ -917,10 +912,7 @@
     </w:p>
     <w:p>
       <w:r>
-        <w:t>“</w:t>
-      </w:r>
-      <w:r>
-        <w:t>We did at that,” said Cerino. “What were you doing out here anyway? There are no big trees over here.”</w:t>
+        <w:t>“We did at that,” said Cerino. “What were you doing out here anyway? There are no big trees over here.”</w:t>
       </w:r>
     </w:p>
     <w:p>

</xml_diff>